<commit_message>
fix table row col naming pdf and clese evenet
</commit_message>
<xml_diff>
--- a/foldertest/13а.docx
+++ b/foldertest/13а.docx
@@ -54,6 +54,263 @@
         <w:t>rwqrwqrqrwq</w:t>
       </w:r>
     </w:p>
+    <w:p>
+      <w:pPr>
+        <w:spacing w:line="240" w:lineRule="auto" w:before="280" w:after="0"/>
+        <w:ind w:left="0" w:right="0" w:firstLine="0"/>
+        <w:jc w:val="left"/>
+      </w:pPr>
+      <w:r>
+        <w:rPr>
+          <w:rFonts w:ascii="Times New Roman" w:hAnsi="Times New Roman"/>
+          <w:i w:val="0"/>
+          <w:color w:val="000000"/>
+          <w:sz w:val="28"/>
+        </w:rPr>
+        <w:t>Таблица 1.1 – Описание</w:t>
+      </w:r>
+    </w:p>
+    <w:tbl>
+      <w:tblPr>
+        <w:tblW w:type="auto" w:w="0"/>
+        <w:tblLayout w:type="fixed"/>
+        <w:tblLook w:firstColumn="1" w:firstRow="1" w:lastColumn="0" w:lastRow="0" w:noHBand="0" w:noVBand="1" w:val="04A0"/>
+      </w:tblPr>
+      <w:tblGrid>
+        <w:gridCol w:w="2422"/>
+        <w:gridCol w:w="2422"/>
+        <w:gridCol w:w="2422"/>
+        <w:gridCol w:w="2422"/>
+      </w:tblGrid>
+      <w:tr>
+        <w:tc>
+          <w:tcPr>
+            <w:tcW w:type="dxa" w:w="2422"/>
+            <w:vAlign w:val="center"/>
+            <w:tcBorders>
+              <w:top w:val="single" w:sz="4" w:color="000000"/>
+              <w:left w:val="single" w:sz="4" w:color="000000"/>
+              <w:bottom w:val="single" w:sz="4" w:color="000000"/>
+              <w:right w:val="single" w:sz="4" w:color="000000"/>
+            </w:tcBorders>
+          </w:tcPr>
+          <w:p>
+            <w:pPr>
+              <w:spacing w:line="240" w:lineRule="auto" w:before="0" w:after="0"/>
+              <w:ind w:left="0" w:right="0" w:firstLine="0"/>
+              <w:jc w:val="center"/>
+            </w:pPr>
+            <w:r>
+              <w:rPr>
+                <w:rFonts w:ascii="Times New Roman" w:hAnsi="Times New Roman"/>
+                <w:i w:val="0"/>
+                <w:color w:val="000000"/>
+                <w:sz w:val="24"/>
+              </w:rPr>
+              <w:t>2</w:t>
+            </w:r>
+          </w:p>
+        </w:tc>
+        <w:tc>
+          <w:tcPr>
+            <w:tcW w:type="dxa" w:w="2422"/>
+            <w:vAlign w:val="center"/>
+            <w:tcBorders>
+              <w:top w:val="single" w:sz="4" w:color="000000"/>
+              <w:left w:val="single" w:sz="4" w:color="000000"/>
+              <w:bottom w:val="single" w:sz="4" w:color="000000"/>
+              <w:right w:val="single" w:sz="4" w:color="000000"/>
+            </w:tcBorders>
+          </w:tcPr>
+          <w:p>
+            <w:pPr>
+              <w:spacing w:line="240" w:lineRule="auto" w:before="0" w:after="0"/>
+              <w:ind w:left="0" w:right="0" w:firstLine="0"/>
+              <w:jc w:val="center"/>
+            </w:pPr>
+            <w:r>
+              <w:rPr>
+                <w:rFonts w:ascii="Times New Roman" w:hAnsi="Times New Roman"/>
+                <w:i w:val="0"/>
+                <w:color w:val="000000"/>
+                <w:sz w:val="24"/>
+              </w:rPr>
+              <w:t>4</w:t>
+            </w:r>
+          </w:p>
+        </w:tc>
+        <w:tc>
+          <w:tcPr>
+            <w:tcW w:type="dxa" w:w="2422"/>
+            <w:vAlign w:val="center"/>
+            <w:tcBorders>
+              <w:top w:val="single" w:sz="4" w:color="000000"/>
+              <w:left w:val="single" w:sz="4" w:color="000000"/>
+              <w:bottom w:val="single" w:sz="4" w:color="000000"/>
+              <w:right w:val="single" w:sz="4" w:color="000000"/>
+            </w:tcBorders>
+          </w:tcPr>
+          <w:p>
+            <w:pPr>
+              <w:spacing w:line="240" w:lineRule="auto" w:before="0" w:after="0"/>
+              <w:ind w:left="0" w:right="0" w:firstLine="0"/>
+              <w:jc w:val="center"/>
+            </w:pPr>
+            <w:r>
+              <w:rPr>
+                <w:rFonts w:ascii="Times New Roman" w:hAnsi="Times New Roman"/>
+                <w:i w:val="0"/>
+                <w:color w:val="000000"/>
+                <w:sz w:val="24"/>
+              </w:rPr>
+              <w:t>45</w:t>
+            </w:r>
+          </w:p>
+        </w:tc>
+        <w:tc>
+          <w:tcPr>
+            <w:tcW w:type="dxa" w:w="2422"/>
+            <w:vAlign w:val="center"/>
+            <w:tcBorders>
+              <w:top w:val="single" w:sz="4" w:color="000000"/>
+              <w:left w:val="single" w:sz="4" w:color="000000"/>
+              <w:bottom w:val="single" w:sz="4" w:color="000000"/>
+              <w:right w:val="single" w:sz="4" w:color="000000"/>
+            </w:tcBorders>
+          </w:tcPr>
+          <w:p>
+            <w:pPr>
+              <w:spacing w:line="240" w:lineRule="auto" w:before="0" w:after="0"/>
+              <w:ind w:left="0" w:right="0" w:firstLine="0"/>
+              <w:jc w:val="center"/>
+            </w:pPr>
+            <w:r>
+              <w:rPr>
+                <w:rFonts w:ascii="Times New Roman" w:hAnsi="Times New Roman"/>
+                <w:i w:val="0"/>
+                <w:color w:val="000000"/>
+                <w:sz w:val="24"/>
+              </w:rPr>
+              <w:t>jbhk</w:t>
+            </w:r>
+          </w:p>
+        </w:tc>
+      </w:tr>
+      <w:tr>
+        <w:tc>
+          <w:tcPr>
+            <w:tcW w:type="dxa" w:w="2422"/>
+            <w:vAlign w:val="center"/>
+            <w:tcBorders>
+              <w:top w:val="single" w:sz="4" w:color="000000"/>
+              <w:left w:val="single" w:sz="4" w:color="000000"/>
+              <w:bottom w:val="single" w:sz="4" w:color="000000"/>
+              <w:right w:val="single" w:sz="4" w:color="000000"/>
+            </w:tcBorders>
+          </w:tcPr>
+          <w:p>
+            <w:pPr>
+              <w:spacing w:line="240" w:lineRule="auto" w:before="0" w:after="0"/>
+              <w:ind w:left="0" w:right="0" w:firstLine="0"/>
+              <w:jc w:val="center"/>
+            </w:pPr>
+            <w:r>
+              <w:rPr>
+                <w:rFonts w:ascii="Times New Roman" w:hAnsi="Times New Roman"/>
+                <w:i w:val="0"/>
+                <w:color w:val="000000"/>
+                <w:sz w:val="24"/>
+              </w:rPr>
+              <w:t>k</w:t>
+            </w:r>
+          </w:p>
+        </w:tc>
+        <w:tc>
+          <w:tcPr>
+            <w:tcW w:type="dxa" w:w="2422"/>
+            <w:vAlign w:val="center"/>
+            <w:tcBorders>
+              <w:top w:val="single" w:sz="4" w:color="000000"/>
+              <w:left w:val="single" w:sz="4" w:color="000000"/>
+              <w:bottom w:val="single" w:sz="4" w:color="000000"/>
+              <w:right w:val="single" w:sz="4" w:color="000000"/>
+            </w:tcBorders>
+          </w:tcPr>
+          <w:p>
+            <w:pPr>
+              <w:spacing w:line="240" w:lineRule="auto" w:before="0" w:after="0"/>
+              <w:ind w:left="0" w:right="0" w:firstLine="0"/>
+              <w:jc w:val="center"/>
+            </w:pPr>
+            <w:r>
+              <w:rPr>
+                <w:rFonts w:ascii="Times New Roman" w:hAnsi="Times New Roman"/>
+                <w:i w:val="0"/>
+                <w:color w:val="000000"/>
+                <w:sz w:val="24"/>
+              </w:rPr>
+              <w:t>njn</w:t>
+            </w:r>
+          </w:p>
+        </w:tc>
+        <w:tc>
+          <w:tcPr>
+            <w:tcW w:type="dxa" w:w="2422"/>
+            <w:vAlign w:val="center"/>
+            <w:tcBorders>
+              <w:top w:val="single" w:sz="4" w:color="000000"/>
+              <w:left w:val="single" w:sz="4" w:color="000000"/>
+              <w:bottom w:val="single" w:sz="4" w:color="000000"/>
+              <w:right w:val="single" w:sz="4" w:color="000000"/>
+            </w:tcBorders>
+          </w:tcPr>
+          <w:p>
+            <w:pPr>
+              <w:spacing w:line="240" w:lineRule="auto" w:before="0" w:after="0"/>
+              <w:ind w:left="0" w:right="0" w:firstLine="0"/>
+              <w:jc w:val="center"/>
+            </w:pPr>
+            <w:r>
+              <w:rPr>
+                <w:rFonts w:ascii="Times New Roman" w:hAnsi="Times New Roman"/>
+                <w:i w:val="0"/>
+                <w:color w:val="000000"/>
+                <w:sz w:val="24"/>
+              </w:rPr>
+              <w:t>h</w:t>
+            </w:r>
+          </w:p>
+        </w:tc>
+        <w:tc>
+          <w:tcPr>
+            <w:tcW w:type="dxa" w:w="2422"/>
+            <w:vAlign w:val="center"/>
+            <w:tcBorders>
+              <w:top w:val="single" w:sz="4" w:color="000000"/>
+              <w:left w:val="single" w:sz="4" w:color="000000"/>
+              <w:bottom w:val="single" w:sz="4" w:color="000000"/>
+              <w:right w:val="single" w:sz="4" w:color="000000"/>
+            </w:tcBorders>
+          </w:tcPr>
+          <w:p>
+            <w:pPr>
+              <w:spacing w:line="240" w:lineRule="auto" w:before="0" w:after="0"/>
+              <w:ind w:left="0" w:right="0" w:firstLine="0"/>
+              <w:jc w:val="center"/>
+            </w:pPr>
+            <w:r>
+              <w:rPr>
+                <w:rFonts w:ascii="Times New Roman" w:hAnsi="Times New Roman"/>
+                <w:i w:val="0"/>
+                <w:color w:val="000000"/>
+                <w:sz w:val="24"/>
+              </w:rPr>
+              <w:t>bhj</w:t>
+            </w:r>
+          </w:p>
+        </w:tc>
+      </w:tr>
+    </w:tbl>
     <w:p>
       <w:pPr>
         <w:pStyle w:val="Heading1"/>

</xml_diff>